<commit_message>
docs: mustaqil ish hujjatlari PDF ko'rinishida ham (bitta manbadan docx+pdf, formulalar mathtext bilan)
Co-authored-by: arena-agent <297053741+arena-agent@users.noreply.github.com>
</commit_message>
<xml_diff>
--- a/docs/oquv/mustaqil-talim/Biokolloid-sistemalar-mustaqil-ish.docx
+++ b/docs/oquv/mustaqil-talim/Biokolloid-sistemalar-mustaqil-ish.docx
@@ -144,61 +144,103 @@
     </w:p>
     <w:p>
       <w:pPr>
-        <w:pStyle w:val="ListNumber"/>
         <w:spacing w:after="40"/>
+        <w:ind w:left="425" w:hanging="283"/>
         <w:jc w:val="both"/>
       </w:pPr>
       <w:r>
+        <w:t xml:space="preserve">1. </w:t>
+      </w:r>
+      <w:r>
+        <w:rPr>
+          <w:b w:val="0"/>
+          <w:i w:val="0"/>
+        </w:rPr>
         <w:t>biokolloidlarni liofil kolloid va polielektrolit sifatida tavsiflash (osmotik bosim, Donnan muvozanati);</w:t>
       </w:r>
     </w:p>
     <w:p>
       <w:pPr>
-        <w:pStyle w:val="ListNumber"/>
         <w:spacing w:after="40"/>
+        <w:ind w:left="425" w:hanging="283"/>
         <w:jc w:val="both"/>
       </w:pPr>
       <w:r>
+        <w:t xml:space="preserve">2. </w:t>
+      </w:r>
+      <w:r>
+        <w:rPr>
+          <w:b w:val="0"/>
+          <w:i w:val="0"/>
+        </w:rPr>
         <w:t>oqsillarning amfolit tabiati, izoelektrik nuqtasi, eruvchanligi, tuzlanishi, elektroforetik va sedimentatsion xossalarini yoritish;</w:t>
       </w:r>
     </w:p>
     <w:p>
       <w:pPr>
-        <w:pStyle w:val="ListNumber"/>
         <w:spacing w:after="40"/>
+        <w:ind w:left="425" w:hanging="283"/>
         <w:jc w:val="both"/>
       </w:pPr>
       <w:r>
+        <w:t xml:space="preserve">3. </w:t>
+      </w:r>
+      <w:r>
+        <w:rPr>
+          <w:b w:val="0"/>
+          <w:i w:val="0"/>
+        </w:rPr>
         <w:t>fermentlarni kolloid katalizatorlar sifatida tahlil qilish (sirt, adsorbsiya, kinetika, immobilizatsiya);</w:t>
       </w:r>
     </w:p>
     <w:p>
       <w:pPr>
-        <w:pStyle w:val="ListNumber"/>
         <w:spacing w:after="40"/>
+        <w:ind w:left="425" w:hanging="283"/>
         <w:jc w:val="both"/>
       </w:pPr>
       <w:r>
+        <w:t xml:space="preserve">4. </w:t>
+      </w:r>
+      <w:r>
+        <w:rPr>
+          <w:b w:val="0"/>
+          <w:i w:val="0"/>
+        </w:rPr>
         <w:t>nuklein kislotalarning polielektrolit xossalarini (zaryad, qarshi ion kondensatsiyasi, qovushqoqlik) ko'rsatish;</w:t>
       </w:r>
     </w:p>
     <w:p>
       <w:pPr>
-        <w:pStyle w:val="ListNumber"/>
         <w:spacing w:after="40"/>
+        <w:ind w:left="425" w:hanging="283"/>
         <w:jc w:val="both"/>
       </w:pPr>
       <w:r>
+        <w:t xml:space="preserve">5. </w:t>
+      </w:r>
+      <w:r>
+        <w:rPr>
+          <w:b w:val="0"/>
+          <w:i w:val="0"/>
+        </w:rPr>
         <w:t>hujayra membranasini assotsiativ kolloid sifatida qarab, KMK, qadoqlanish parametri va membrana potensialini tushuntirish;</w:t>
       </w:r>
     </w:p>
     <w:p>
       <w:pPr>
-        <w:pStyle w:val="ListNumber"/>
         <w:spacing w:after="40"/>
+        <w:ind w:left="425" w:hanging="283"/>
         <w:jc w:val="both"/>
       </w:pPr>
       <w:r>
+        <w:t xml:space="preserve">6. </w:t>
+      </w:r>
+      <w:r>
+        <w:rPr>
+          <w:b w:val="0"/>
+          <w:i w:val="0"/>
+        </w:rPr>
         <w:t>tadqiqot usullarini umumlashtirish.</w:t>
       </w:r>
     </w:p>
@@ -212,113 +254,170 @@
     </w:p>
     <w:p>
       <w:pPr>
-        <w:pStyle w:val="ListNumber"/>
         <w:spacing w:after="40"/>
+        <w:ind w:left="425" w:hanging="283"/>
         <w:jc w:val="both"/>
       </w:pPr>
       <w:r>
+        <w:t xml:space="preserve">1. </w:t>
+      </w:r>
+      <w:r>
         <w:rPr>
           <w:b/>
+          <w:i w:val="0"/>
         </w:rPr>
         <w:t xml:space="preserve">Biokolloidlarning umumiy xususiyatlari: </w:t>
       </w:r>
       <w:r>
+        <w:rPr>
+          <w:b w:val="0"/>
+          <w:i w:val="0"/>
+        </w:rPr>
         <w:t>liofillik, solvatlanish, osmotik bosim, Donnan muvozanati.</w:t>
       </w:r>
     </w:p>
     <w:p>
       <w:pPr>
-        <w:pStyle w:val="ListNumber"/>
         <w:spacing w:after="40"/>
+        <w:ind w:left="425" w:hanging="283"/>
         <w:jc w:val="both"/>
       </w:pPr>
       <w:r>
+        <w:t xml:space="preserve">2. </w:t>
+      </w:r>
+      <w:r>
         <w:rPr>
           <w:b/>
+          <w:i w:val="0"/>
         </w:rPr>
         <w:t xml:space="preserve">Oqsillar: </w:t>
       </w:r>
       <w:r>
+        <w:rPr>
+          <w:b w:val="0"/>
+          <w:i w:val="0"/>
+        </w:rPr>
         <w:t>amfolit, izoelektrik nuqta, eruvchanlik va tuzlash, elektroforez, sedimentatsiya (Svedberg), denaturatsiya, gel va koatservat.</w:t>
       </w:r>
     </w:p>
     <w:p>
       <w:pPr>
-        <w:pStyle w:val="ListNumber"/>
         <w:spacing w:after="40"/>
+        <w:ind w:left="425" w:hanging="283"/>
         <w:jc w:val="both"/>
       </w:pPr>
       <w:r>
+        <w:t xml:space="preserve">3. </w:t>
+      </w:r>
+      <w:r>
         <w:rPr>
           <w:b/>
+          <w:i w:val="0"/>
         </w:rPr>
         <w:t xml:space="preserve">Fermentlar: </w:t>
       </w:r>
       <w:r>
+        <w:rPr>
+          <w:b w:val="0"/>
+          <w:i w:val="0"/>
+        </w:rPr>
         <w:t>kolloid katalizator, faol markaz va sirt, Mixaelis–Menten kinetikasi, adsorbsiya va immobilizatsiya.</w:t>
       </w:r>
     </w:p>
     <w:p>
       <w:pPr>
-        <w:pStyle w:val="ListNumber"/>
         <w:spacing w:after="40"/>
+        <w:ind w:left="425" w:hanging="283"/>
         <w:jc w:val="both"/>
       </w:pPr>
       <w:r>
+        <w:t xml:space="preserve">4. </w:t>
+      </w:r>
+      <w:r>
         <w:rPr>
           <w:b/>
+          <w:i w:val="0"/>
         </w:rPr>
         <w:t xml:space="preserve">Nuklein kislotalar: </w:t>
       </w:r>
       <w:r>
+        <w:rPr>
+          <w:b w:val="0"/>
+          <w:i w:val="0"/>
+        </w:rPr>
         <w:t>polielektrolit, Manning kondensatsiyasi, persistent uzunlik, qovushqoqlik, kondensatsiya va gel-elektroforez.</w:t>
       </w:r>
     </w:p>
     <w:p>
       <w:pPr>
-        <w:pStyle w:val="ListNumber"/>
         <w:spacing w:after="40"/>
+        <w:ind w:left="425" w:hanging="283"/>
         <w:jc w:val="both"/>
       </w:pPr>
       <w:r>
+        <w:t xml:space="preserve">5. </w:t>
+      </w:r>
+      <w:r>
         <w:rPr>
           <w:b/>
+          <w:i w:val="0"/>
         </w:rPr>
         <w:t xml:space="preserve">Hujayra membranalari: </w:t>
       </w:r>
       <w:r>
+        <w:rPr>
+          <w:b w:val="0"/>
+          <w:i w:val="0"/>
+        </w:rPr>
         <w:t>amfifillar, KMK, qadoqlanish parametri, lipid bikatlam va liposomalar, sirt zaryadi, membrana potensiali, osmos.</w:t>
       </w:r>
     </w:p>
     <w:p>
       <w:pPr>
-        <w:pStyle w:val="ListNumber"/>
         <w:spacing w:after="40"/>
+        <w:ind w:left="425" w:hanging="283"/>
         <w:jc w:val="both"/>
       </w:pPr>
       <w:r>
+        <w:t xml:space="preserve">6. </w:t>
+      </w:r>
+      <w:r>
         <w:rPr>
           <w:b/>
+          <w:i w:val="0"/>
         </w:rPr>
         <w:t xml:space="preserve">Tadqiqot usullari </w:t>
       </w:r>
       <w:r>
+        <w:rPr>
+          <w:b w:val="0"/>
+          <w:i w:val="0"/>
+        </w:rPr>
         <w:t>va amaliy ahamiyati.</w:t>
       </w:r>
     </w:p>
     <w:p>
       <w:pPr>
-        <w:pStyle w:val="ListNumber"/>
         <w:spacing w:after="40"/>
+        <w:ind w:left="425" w:hanging="283"/>
         <w:jc w:val="both"/>
       </w:pPr>
       <w:r>
+        <w:t xml:space="preserve">7. </w:t>
+      </w:r>
+      <w:r>
         <w:rPr>
           <w:b/>
+          <w:i w:val="0"/>
         </w:rPr>
         <w:t>Xulosa.</w:t>
       </w:r>
-      <w:r/>
+      <w:r>
+        <w:rPr>
+          <w:b w:val="0"/>
+          <w:i w:val="0"/>
+        </w:rPr>
+      </w:r>
     </w:p>
     <w:p>
       <w:pPr>
@@ -1585,10 +1684,15 @@
       <w:r>
         <w:rPr>
           <w:b/>
+          <w:i w:val="0"/>
         </w:rPr>
         <w:t xml:space="preserve">Gidrat qobiq va shishish: </w:t>
       </w:r>
       <w:r>
+        <w:rPr>
+          <w:b w:val="0"/>
+          <w:i w:val="0"/>
+        </w:rPr>
         <w:t>oqsil 1 g ga 0,3–0,5 g "bog'langan" suv tutadi; jelatin va boshqa fibrillyar oqsillar cheksiz shishib eritma, cheklangan shishib gel hosil qiladi (shishish bosimi yuzlab atm ga yetadi).</w:t>
       </w:r>
     </w:p>
@@ -1601,10 +1705,15 @@
       <w:r>
         <w:rPr>
           <w:b/>
+          <w:i w:val="0"/>
         </w:rPr>
         <w:t xml:space="preserve">Denaturatsiya: </w:t>
       </w:r>
       <w:r>
+        <w:rPr>
+          <w:b w:val="0"/>
+          <w:i w:val="0"/>
+        </w:rPr>
         <w:t>harorat, pH, og'ir metallar, mochevina, organik erituvchilar tabiiy konformatsiyani buzadi → gidrofob guruhlar ochiladi, eruvchanlik pasayadi, koagulyatsiya (qaytmas kolloid holat) sodir bo'ladi.</w:t>
       </w:r>
     </w:p>
@@ -1617,10 +1726,15 @@
       <w:r>
         <w:rPr>
           <w:b/>
+          <w:i w:val="0"/>
         </w:rPr>
         <w:t xml:space="preserve">Koatservatsiya va himoya ta'siri: </w:t>
       </w:r>
       <w:r>
+        <w:rPr>
+          <w:b w:val="0"/>
+          <w:i w:val="0"/>
+        </w:rPr>
         <w:t>qarama-qarshi zaryadli biopolimerlar (jelatin–gummiarabik) suyuq kolloid fazaga ajraladi (mikrokapsulalash asosi); oqsillar liofob zollarni adsorbsion qobiq bilan koagulyatsiyadan himoya qiladi ("oltin soni").</w:t>
       </w:r>
     </w:p>
@@ -2031,10 +2145,15 @@
       <w:r>
         <w:rPr>
           <w:b/>
+          <w:i w:val="0"/>
         </w:rPr>
         <w:t xml:space="preserve">Kolloid holatga bog'liqlik: </w:t>
       </w:r>
       <w:r>
+        <w:rPr>
+          <w:b w:val="0"/>
+          <w:i w:val="0"/>
+        </w:rPr>
         <w:t>faollik pH (zaryad holati, pI ga nisbatan optimum) va haroratga (denaturatsiya) kuchli bog'liq; ion kuchi faol markaz yaqinidagi elektrostatik maydonni o'zgartiradi.</w:t>
       </w:r>
     </w:p>
@@ -2047,10 +2166,15 @@
       <w:r>
         <w:rPr>
           <w:b/>
+          <w:i w:val="0"/>
         </w:rPr>
         <w:t xml:space="preserve">Sirt faol moddalar ta'siri: </w:t>
       </w:r>
       <w:r>
+        <w:rPr>
+          <w:b w:val="0"/>
+          <w:i w:val="0"/>
+        </w:rPr>
         <w:t>SDS kabi ionogen SFM lar fermentni denaturatsiya qiladi; noionogen SFM va teskari mitsellalar esa fermentni organik muhitda faol holda saqlaydi (mitsellyar enzimologiya).</w:t>
       </w:r>
     </w:p>
@@ -2063,10 +2187,15 @@
       <w:r>
         <w:rPr>
           <w:b/>
+          <w:i w:val="0"/>
         </w:rPr>
         <w:t xml:space="preserve">Nanobiokataliz: </w:t>
       </w:r>
       <w:r>
+        <w:rPr>
+          <w:b w:val="0"/>
+          <w:i w:val="0"/>
+        </w:rPr>
         <w:t>Au, SiO₂, Fe₃O₄ nanozarrachalarga immobilizatsiya; ferment–nanozarracha konyugatlari biosensorlarda (glyukoza-oksidaza elektrodlari) qo'llanadi.</w:t>
       </w:r>
     </w:p>
@@ -2441,10 +2570,15 @@
       <w:r>
         <w:rPr>
           <w:b/>
+          <w:i w:val="0"/>
         </w:rPr>
         <w:t xml:space="preserve">Gel-elektroforez: </w:t>
       </w:r>
       <w:r>
+        <w:rPr>
+          <w:b w:val="0"/>
+          <w:i w:val="0"/>
+        </w:rPr>
         <w:t>zaryad/uzunlik nisbati doimiy bo'lgani uchun erkin eritmada harakatchanlik uzunlikka bog'liq emas; agaroza/poliakrilamid gelida elakdan o'tish (reptatsiya) tufayli harakatchanlik lg(uzunlik) ga teskari proporsional — fragmentlar o'lcham bo'yicha ajraladi.</w:t>
       </w:r>
     </w:p>
@@ -2457,10 +2591,15 @@
       <w:r>
         <w:rPr>
           <w:b/>
+          <w:i w:val="0"/>
         </w:rPr>
         <w:t xml:space="preserve">Erish (denaturatsiya) harorati: </w:t>
       </w:r>
       <w:r>
+        <w:rPr>
+          <w:b w:val="0"/>
+          <w:i w:val="0"/>
+        </w:rPr>
         <w:t>T_m ion kuchi oshishi bilan ortadi (qarshi ionlar fosfatlar itarilishini ekranlaydi) va GC-juftlar ulushi bilan chiziqli bog'liq; gipoxrom effekt (260 nm da yutilish ≈ 40 % ortadi) orqali kuzatiladi.</w:t>
       </w:r>
     </w:p>
@@ -2473,10 +2612,15 @@
       <w:r>
         <w:rPr>
           <w:b/>
+          <w:i w:val="0"/>
         </w:rPr>
         <w:t xml:space="preserve">Kolloid komplekslar: </w:t>
       </w:r>
       <w:r>
+        <w:rPr>
+          <w:b w:val="0"/>
+          <w:i w:val="0"/>
+        </w:rPr>
         <w:t>DNK–kationli lipid (lipopleks), DNK–polikation (polipleks), DNK–Au nanozarracha konyugatlari — gen terapiyasi va biosensorikaning asosi; ularning barqarorligi DLVO va polielektrolit nazariyasi bilan tavsiflanadi.</w:t>
       </w:r>
     </w:p>
@@ -2775,10 +2919,15 @@
       <w:r>
         <w:rPr>
           <w:b/>
+          <w:i w:val="0"/>
         </w:rPr>
         <w:t xml:space="preserve">Lipid bikatlam va liposomalar: </w:t>
       </w:r>
       <w:r>
+        <w:rPr>
+          <w:b w:val="0"/>
+          <w:i w:val="0"/>
+        </w:rPr>
         <w:t>qalinligi ≈ 4–5 nm; sun'iy vezikulalar (liposomalar, 50–200 nm) — dori va mRNK yetkazishning asosiy kolloid tashuvchisi; PEG-lipidlar sterik stabilizatsiya beradi ("stealth" liposomalar).</w:t>
       </w:r>
     </w:p>
@@ -2791,10 +2940,15 @@
       <w:r>
         <w:rPr>
           <w:b/>
+          <w:i w:val="0"/>
         </w:rPr>
         <w:t xml:space="preserve">Suyuq-mozaik model va fazaviy o'tishlar: </w:t>
       </w:r>
       <w:r>
+        <w:rPr>
+          <w:b w:val="0"/>
+          <w:i w:val="0"/>
+        </w:rPr>
         <w:t>bikatlam ikki o'lchamli suyuqlik; lipidlar lateral diffuziya qiladi (D ≈ 10⁻⁸ sm²/s), gel ↔ suyuq-kristall o'tish harorati T_m dum uzunligi bilan ortadi, to'yinmaganlik va xolesterin bilan o'zgaradi; raftlar — kolloid mikrofazalar.</w:t>
       </w:r>
     </w:p>
@@ -2807,10 +2961,15 @@
       <w:r>
         <w:rPr>
           <w:b/>
+          <w:i w:val="0"/>
         </w:rPr>
         <w:t xml:space="preserve">Sirt zaryadi: </w:t>
       </w:r>
       <w:r>
+        <w:rPr>
+          <w:b w:val="0"/>
+          <w:i w:val="0"/>
+        </w:rPr>
         <w:t>fosfatidilserin, fosfatidilinozitol va sialik kislotalar tufayli hujayra sirti manfiy (ζ ≈ −10…−30 mV); bu hujayralar agregatsiyasini oldini oladi va kationli nanozarracha/oqsillarning adsorbsiyasini belgilaydi.</w:t>
       </w:r>
     </w:p>
@@ -3508,6 +3667,10 @@
         <w:jc w:val="both"/>
       </w:pPr>
       <w:r>
+        <w:rPr>
+          <w:b w:val="0"/>
+          <w:i w:val="0"/>
+        </w:rPr>
         <w:t>Biotexnologiya: oqsillarni tuzlash, izoelektrik cho'ktirish, xromatografiya va elektroforez orqali ajratish; ferment immobilizatsiyasi va biokatalitik reaktorlar.</w:t>
       </w:r>
     </w:p>
@@ -3518,6 +3681,10 @@
         <w:jc w:val="both"/>
       </w:pPr>
       <w:r>
+        <w:rPr>
+          <w:b w:val="0"/>
+          <w:i w:val="0"/>
+        </w:rPr>
         <w:t>Farmatsevtika: liposoma va lipid nanozarrachalar (mRNK vaksinalari), oqsil preparatlarini agregatsiyadan saqlash (formulyatsiya), DNK/RNK yetkazish komplekslari.</w:t>
       </w:r>
     </w:p>
@@ -3528,6 +3695,10 @@
         <w:jc w:val="both"/>
       </w:pPr>
       <w:r>
+        <w:rPr>
+          <w:b w:val="0"/>
+          <w:i w:val="0"/>
+        </w:rPr>
         <w:t>Tibbiyot: qon plazmasining onkotik bosimi va shishlar, eritrotsit cho'kish tezligi (EChT), gemodializ, izotonik eritmalar; membrana potensiali buzilishi — kardiologiya va nevrologiya.</w:t>
       </w:r>
     </w:p>
@@ -3538,6 +3709,10 @@
         <w:jc w:val="both"/>
       </w:pPr>
       <w:r>
+        <w:rPr>
+          <w:b w:val="0"/>
+          <w:i w:val="0"/>
+        </w:rPr>
         <w:t>Oziq-ovqat kimyosi: sut (kazein mitsellalari), jelatin gellari, emulsiyalar, oqsil ko'piklari — barchasi biokolloid sistemalar.</w:t>
       </w:r>
     </w:p>
@@ -3551,61 +3726,103 @@
     </w:p>
     <w:p>
       <w:pPr>
-        <w:pStyle w:val="ListNumber"/>
         <w:spacing w:after="40"/>
+        <w:ind w:left="425" w:hanging="283"/>
         <w:jc w:val="both"/>
       </w:pPr>
       <w:r>
+        <w:t xml:space="preserve">1. </w:t>
+      </w:r>
+      <w:r>
+        <w:rPr>
+          <w:b w:val="0"/>
+          <w:i w:val="0"/>
+        </w:rPr>
         <w:t>Biokolloidlar — liofil, termodinamik barqaror va qaytar kolloid sistemalar; ularning xossalari gidrat qobiq, sirt zaryadi va polielektrolit tabiati bilan belgilanadi, osmotik bosim va ion taqsimoti esa virial va Donnan tenglamalari bilan tavsiflanadi.</w:t>
       </w:r>
     </w:p>
     <w:p>
       <w:pPr>
-        <w:pStyle w:val="ListNumber"/>
         <w:spacing w:after="40"/>
+        <w:ind w:left="425" w:hanging="283"/>
         <w:jc w:val="both"/>
       </w:pPr>
       <w:r>
+        <w:t xml:space="preserve">2. </w:t>
+      </w:r>
+      <w:r>
+        <w:rPr>
+          <w:b w:val="0"/>
+          <w:i w:val="0"/>
+        </w:rPr>
         <w:t>Oqsillar amfolit bo'lib, izoelektrik nuqta ularning eruvchanligi, shishishi, qovushqoqligi va elektroforetik harakatchanligining minimumini belgilaydi; tuzlash (Kon tenglamasi, Gofmeyster qatori) va sedimentatsiya (Svedberg) — ajratish va tavsiflashning asosiy vositalari.</w:t>
       </w:r>
     </w:p>
     <w:p>
       <w:pPr>
-        <w:pStyle w:val="ListNumber"/>
         <w:spacing w:after="40"/>
+        <w:ind w:left="425" w:hanging="283"/>
         <w:jc w:val="both"/>
       </w:pPr>
       <w:r>
+        <w:t xml:space="preserve">3. </w:t>
+      </w:r>
+      <w:r>
+        <w:rPr>
+          <w:b w:val="0"/>
+          <w:i w:val="0"/>
+        </w:rPr>
         <w:t>Fermentlar — adsorbsion tipdagi kolloid katalizatorlar: Mixaelis–Menten kinetikasi Lengmyur izotermasiga mos keladi; immobilizatsiya kolloid sirt orqali faollik va barqarorlikni boshqarish imkonini beradi.</w:t>
       </w:r>
     </w:p>
     <w:p>
       <w:pPr>
-        <w:pStyle w:val="ListNumber"/>
         <w:spacing w:after="40"/>
+        <w:ind w:left="425" w:hanging="283"/>
         <w:jc w:val="both"/>
       </w:pPr>
       <w:r>
+        <w:t xml:space="preserve">4. </w:t>
+      </w:r>
+      <w:r>
+        <w:rPr>
+          <w:b w:val="0"/>
+          <w:i w:val="0"/>
+        </w:rPr>
         <w:t>Nuklein kislotalar — kuchli chiziqli polielektrolitlar: Manning kondensatsiyasi samarali zaryadni kamaytiradi, ko'p zaryadli ionlar DNKni kompaktlashtiradi; qovushqoqlik va gel-elektroforez molyar massa va konformatsiyani beradi.</w:t>
       </w:r>
     </w:p>
     <w:p>
       <w:pPr>
-        <w:pStyle w:val="ListNumber"/>
         <w:spacing w:after="40"/>
+        <w:ind w:left="425" w:hanging="283"/>
         <w:jc w:val="both"/>
       </w:pPr>
       <w:r>
+        <w:t xml:space="preserve">5. </w:t>
+      </w:r>
+      <w:r>
+        <w:rPr>
+          <w:b w:val="0"/>
+          <w:i w:val="0"/>
+        </w:rPr>
         <w:t>Hujayra membranasi — amfifil lipidlarning o'z-o'zini tashkil etgan assotsiativ kolloidi; qadoqlanish parametri bikatlam shaklini, tanlab o'tkazuvchanlik esa Nernst/Donnan potensialini va osmotik muvozanatni belgilaydi.</w:t>
       </w:r>
     </w:p>
     <w:p>
       <w:pPr>
-        <w:pStyle w:val="ListNumber"/>
         <w:spacing w:after="40"/>
+        <w:ind w:left="425" w:hanging="283"/>
         <w:jc w:val="both"/>
       </w:pPr>
       <w:r>
+        <w:t xml:space="preserve">6. </w:t>
+      </w:r>
+      <w:r>
+        <w:rPr>
+          <w:b w:val="0"/>
+          <w:i w:val="0"/>
+        </w:rPr>
         <w:t>Shunday qilib, tirik hujayradagi asosiy jarayonlar — eruvchanlik va agregatsiya, kataliz, genetik axborotni saqlash va tashish, moddalar almashinuvi — kolloid kimyo qonuniyatlari asosida tushuntiriladi va boshqariladi.</w:t>
       </w:r>
     </w:p>

</xml_diff>

<commit_message>
docs: farmatsevtik kolloid sistemalar mustaqil ishi (docx+pdf); mathtext da % va ⁺/⁻ belgilari
Co-authored-by: arena-agent <297053741+arena-agent@users.noreply.github.com>
</commit_message>
<xml_diff>
--- a/docs/oquv/mustaqil-talim/Biokolloid-sistemalar-mustaqil-ish.docx
+++ b/docs/oquv/mustaqil-talim/Biokolloid-sistemalar-mustaqil-ish.docx
@@ -2600,7 +2600,7 @@
           <w:b w:val="0"/>
           <w:i w:val="0"/>
         </w:rPr>
-        <w:t>T_m ion kuchi oshishi bilan ortadi (qarshi ionlar fosfatlar itarilishini ekranlaydi) va GC-juftlar ulushi bilan chiziqli bog'liq; gipoxrom effekt (260 nm da yutilish ≈ 40 % ortadi) orqali kuzatiladi.</w:t>
+        <w:t>Tₘ ion kuchi oshishi bilan ortadi (qarshi ionlar fosfatlar itarilishini ekranlaydi) va GC-juftlar ulushi bilan chiziqli bog'liq; gipoxrom effekt (260 nm da yutilish ≈ 40 % ortadi) orqali kuzatiladi.</w:t>
       </w:r>
     </w:p>
     <w:p>
@@ -2949,7 +2949,7 @@
           <w:b w:val="0"/>
           <w:i w:val="0"/>
         </w:rPr>
-        <w:t>bikatlam ikki o'lchamli suyuqlik; lipidlar lateral diffuziya qiladi (D ≈ 10⁻⁸ sm²/s), gel ↔ suyuq-kristall o'tish harorati T_m dum uzunligi bilan ortadi, to'yinmaganlik va xolesterin bilan o'zgaradi; raftlar — kolloid mikrofazalar.</w:t>
+        <w:t>bikatlam ikki o'lchamli suyuqlik; lipidlar lateral diffuziya qiladi (D ≈ 10⁻⁸ sm²/s), gel ↔ suyuq-kristall o'tish harorati Tₘ dum uzunligi bilan ortadi, to'yinmaganlik va xolesterin bilan o'zgaradi; raftlar — kolloid mikrofazalar.</w:t>
       </w:r>
     </w:p>
     <w:p>
@@ -3495,7 +3495,7 @@
               <w:rPr>
                 <w:sz w:val="22"/>
               </w:rPr>
-              <w:t>konformatsiya, T_m, bog'lanish</w:t>
+              <w:t>konformatsiya, Tₘ, bog'lanish</w:t>
             </w:r>
           </w:p>
         </w:tc>

</xml_diff>